<commit_message>
Added all presentations for mandatory labs
</commit_message>
<xml_diff>
--- a/LAB V/Tema5.docx
+++ b/LAB V/Tema5.docx
@@ -54,6 +54,113 @@
         </w:rPr>
         <w:t>Problema 6.1</w:t>
       </w:r>
+    </w:p>
+    <w:p>
+      <w:pPr>
+        <w:rPr>
+          <w:rFonts w:ascii="Arial" w:hAnsi="Arial" w:cs="Arial"/>
+          <w:b/>
+          <w:bCs/>
+          <w:sz w:val="36"/>
+          <w:szCs w:val="36"/>
+        </w:rPr>
+      </w:pPr>
+      <w:r>
+        <w:rPr>
+          <w:rFonts w:ascii="AppleSystemUIFont" w:hAnsi="AppleSystemUIFont" w:cs="AppleSystemUIFont"/>
+          <w:kern w:val="0"/>
+          <w:sz w:val="26"/>
+          <w:szCs w:val="26"/>
+        </w:rPr>
+        <w:t>(ARMAX cu MMEP): Este deja implementată parțial în I</w:t>
+      </w:r>
+      <w:r>
+        <w:rPr>
+          <w:rFonts w:ascii="AppleSystemUIFont" w:hAnsi="AppleSystemUIFont" w:cs="AppleSystemUIFont"/>
+          <w:b/>
+          <w:bCs/>
+          <w:kern w:val="0"/>
+          <w:sz w:val="26"/>
+          <w:szCs w:val="26"/>
+        </w:rPr>
+        <w:t>SLAB_6A.m.</w:t>
+      </w:r>
+      <w:r>
+        <w:rPr>
+          <w:rFonts w:ascii="AppleSystemUIFont" w:hAnsi="AppleSystemUIFont" w:cs="AppleSystemUIFont"/>
+          <w:kern w:val="0"/>
+          <w:sz w:val="26"/>
+          <w:szCs w:val="26"/>
+        </w:rPr>
+        <w:t xml:space="preserve"> Aceasta folosește metoda minimiz</w:t>
+      </w:r>
+      <w:r>
+        <w:rPr>
+          <w:rFonts w:ascii="AppleSystemUIFont" w:hAnsi="AppleSystemUIFont" w:cs="AppleSystemUIFont"/>
+          <w:kern w:val="0"/>
+          <w:sz w:val="26"/>
+          <w:szCs w:val="26"/>
+        </w:rPr>
+        <w:t>a</w:t>
+      </w:r>
+      <w:r>
+        <w:rPr>
+          <w:rFonts w:ascii="AppleSystemUIFont" w:hAnsi="AppleSystemUIFont" w:cs="AppleSystemUIFont"/>
+          <w:kern w:val="0"/>
+          <w:sz w:val="26"/>
+          <w:szCs w:val="26"/>
+        </w:rPr>
+        <w:t xml:space="preserve">rii erorii de predicție (MMEP) pentru </w:t>
+      </w:r>
+      <w:proofErr w:type="gramStart"/>
+      <w:r>
+        <w:rPr>
+          <w:rFonts w:ascii="AppleSystemUIFont" w:hAnsi="AppleSystemUIFont" w:cs="AppleSystemUIFont"/>
+          <w:kern w:val="0"/>
+          <w:sz w:val="26"/>
+          <w:szCs w:val="26"/>
+        </w:rPr>
+        <w:t>a</w:t>
+      </w:r>
+      <w:proofErr w:type="gramEnd"/>
+      <w:r>
+        <w:rPr>
+          <w:rFonts w:ascii="AppleSystemUIFont" w:hAnsi="AppleSystemUIFont" w:cs="AppleSystemUIFont"/>
+          <w:kern w:val="0"/>
+          <w:sz w:val="26"/>
+          <w:szCs w:val="26"/>
+        </w:rPr>
+        <w:t xml:space="preserve"> identifica un model ARMAX. Se bazeaz</w:t>
+      </w:r>
+      <w:r>
+        <w:rPr>
+          <w:rFonts w:ascii="AppleSystemUIFont" w:hAnsi="AppleSystemUIFont" w:cs="AppleSystemUIFont"/>
+          <w:kern w:val="0"/>
+          <w:sz w:val="26"/>
+          <w:szCs w:val="26"/>
+        </w:rPr>
+        <w:t>a</w:t>
+      </w:r>
+      <w:r>
+        <w:rPr>
+          <w:rFonts w:ascii="AppleSystemUIFont" w:hAnsi="AppleSystemUIFont" w:cs="AppleSystemUIFont"/>
+          <w:kern w:val="0"/>
+          <w:sz w:val="26"/>
+          <w:szCs w:val="26"/>
+        </w:rPr>
+        <w:t xml:space="preserve"> pe funcția armax din MATLAB System Identification Toolbox.</w:t>
+      </w:r>
+    </w:p>
+    <w:p>
+      <w:pPr>
+        <w:rPr>
+          <w:rFonts w:ascii="Arial" w:hAnsi="Arial" w:cs="Arial"/>
+          <w:b/>
+          <w:bCs/>
+          <w:sz w:val="36"/>
+          <w:szCs w:val="36"/>
+        </w:rPr>
+      </w:pPr>
       <w:r>
         <w:rPr>
           <w:rFonts w:ascii="Arial" w:hAnsi="Arial" w:cs="Arial"/>
@@ -232,9 +339,7 @@
           <w:szCs w:val="36"/>
         </w:rPr>
       </w:pPr>
-    </w:p>
-    <w:p>
-      <w:pPr>
+      <w:r>
         <w:rPr>
           <w:rFonts w:ascii="Arial" w:hAnsi="Arial" w:cs="Arial"/>
           <w:b/>
@@ -242,7 +347,48 @@
           <w:sz w:val="36"/>
           <w:szCs w:val="36"/>
         </w:rPr>
-      </w:pPr>
+        <w:lastRenderedPageBreak/>
+        <w:t>Problema 6.2</w:t>
+      </w:r>
+    </w:p>
+    <w:p>
+      <w:pPr>
+        <w:rPr>
+          <w:rFonts w:ascii="AppleSystemUIFont" w:hAnsi="AppleSystemUIFont" w:cs="AppleSystemUIFont"/>
+          <w:kern w:val="0"/>
+          <w:sz w:val="26"/>
+          <w:szCs w:val="26"/>
+        </w:rPr>
+      </w:pPr>
+      <w:r>
+        <w:rPr>
+          <w:rFonts w:ascii="AppleSystemUIFont" w:hAnsi="AppleSystemUIFont" w:cs="AppleSystemUIFont"/>
+          <w:kern w:val="0"/>
+          <w:sz w:val="26"/>
+          <w:szCs w:val="26"/>
+        </w:rPr>
+        <w:t>BJ cu MMEP): Trebuie creat un simulator similar (</w:t>
+      </w:r>
+      <w:r>
+        <w:rPr>
+          <w:rFonts w:ascii="AppleSystemUIFont" w:hAnsi="AppleSystemUIFont" w:cs="AppleSystemUIFont"/>
+          <w:b/>
+          <w:bCs/>
+          <w:kern w:val="0"/>
+          <w:sz w:val="26"/>
+          <w:szCs w:val="26"/>
+        </w:rPr>
+        <w:t>ISLAB_6B.m</w:t>
+      </w:r>
+      <w:r>
+        <w:rPr>
+          <w:rFonts w:ascii="AppleSystemUIFont" w:hAnsi="AppleSystemUIFont" w:cs="AppleSystemUIFont"/>
+          <w:kern w:val="0"/>
+          <w:sz w:val="26"/>
+          <w:szCs w:val="26"/>
+        </w:rPr>
+        <w:t>) pentru modelul Box-Jenkins (BJ), folosind funcția bj din MATLAB.</w:t>
+      </w:r>
     </w:p>
     <w:p>
       <w:pPr>
@@ -254,27 +400,6 @@
           <w:szCs w:val="36"/>
         </w:rPr>
       </w:pPr>
-      <w:r>
-        <w:rPr>
-          <w:rFonts w:ascii="Arial" w:hAnsi="Arial" w:cs="Arial"/>
-          <w:b/>
-          <w:bCs/>
-          <w:sz w:val="36"/>
-          <w:szCs w:val="36"/>
-        </w:rPr>
-        <w:lastRenderedPageBreak/>
-        <w:t>Problema 6.</w:t>
-      </w:r>
-      <w:r>
-        <w:rPr>
-          <w:rFonts w:ascii="Arial" w:hAnsi="Arial" w:cs="Arial"/>
-          <w:b/>
-          <w:bCs/>
-          <w:sz w:val="36"/>
-          <w:szCs w:val="36"/>
-        </w:rPr>
-        <w:t>2</w:t>
-      </w:r>
       <w:r>
         <w:rPr>
           <w:rFonts w:ascii="Arial" w:hAnsi="Arial" w:cs="Arial"/>
@@ -352,31 +477,7 @@
         <w:rPr>
           <w:rFonts w:ascii="Arial" w:hAnsi="Arial" w:cs="Arial"/>
         </w:rPr>
-        <w:t>si am redus numarul maxim al idndicilor, avand</w:t>
-      </w:r>
-      <w:r>
-        <w:rPr>
-          <w:rFonts w:ascii="Arial" w:hAnsi="Arial" w:cs="Arial"/>
-        </w:rPr>
-        <w:t xml:space="preserve"> i</w:t>
-      </w:r>
-      <w:r>
-        <w:rPr>
-          <w:rFonts w:ascii="Arial" w:hAnsi="Arial" w:cs="Arial"/>
-        </w:rPr>
-        <w:t xml:space="preserve">n </w:t>
-      </w:r>
-      <w:r>
-        <w:rPr>
-          <w:rFonts w:ascii="Arial" w:hAnsi="Arial" w:cs="Arial"/>
-        </w:rPr>
-        <w:t>v</w:t>
-      </w:r>
-      <w:r>
-        <w:rPr>
-          <w:rFonts w:ascii="Arial" w:hAnsi="Arial" w:cs="Arial"/>
-        </w:rPr>
-        <w:t xml:space="preserve">edere numarul de combinatii de parametrii (avem 4 </w:t>
+        <w:t xml:space="preserve">si am redus numarul maxim al idndicilor, avand in vedere numarul de combinatii de parametrii (avem 4 </w:t>
       </w:r>
       <w:proofErr w:type="gramStart"/>
       <w:r>
@@ -390,19 +491,7 @@
         <w:rPr>
           <w:rFonts w:ascii="Arial" w:hAnsi="Arial" w:cs="Arial"/>
         </w:rPr>
-        <w:t xml:space="preserve"> deci ar dura f</w:t>
-      </w:r>
-      <w:r>
-        <w:rPr>
-          <w:rFonts w:ascii="Arial" w:hAnsi="Arial" w:cs="Arial"/>
-        </w:rPr>
-        <w:t>oarte</w:t>
-      </w:r>
-      <w:r>
-        <w:rPr>
-          <w:rFonts w:ascii="Arial" w:hAnsi="Arial" w:cs="Arial"/>
-        </w:rPr>
-        <w:t xml:space="preserve"> mult…</w:t>
+        <w:t xml:space="preserve"> deci ar dura foarte mult…</w:t>
       </w:r>
     </w:p>
     <w:p>
@@ -478,6 +567,138 @@
           <w:szCs w:val="36"/>
         </w:rPr>
         <w:t>3</w:t>
+      </w:r>
+    </w:p>
+    <w:p>
+      <w:pPr>
+        <w:autoSpaceDE w:val="0"/>
+        <w:autoSpaceDN w:val="0"/>
+        <w:adjustRightInd w:val="0"/>
+        <w:spacing w:after="0" w:line="240" w:lineRule="auto"/>
+        <w:rPr>
+          <w:rFonts w:ascii="AppleSystemUIFont" w:hAnsi="AppleSystemUIFont" w:cs="AppleSystemUIFont"/>
+          <w:kern w:val="0"/>
+          <w:sz w:val="26"/>
+          <w:szCs w:val="26"/>
+        </w:rPr>
+      </w:pPr>
+      <w:r>
+        <w:rPr>
+          <w:rFonts w:ascii="AppleSystemUIFont" w:hAnsi="AppleSystemUIFont" w:cs="AppleSystemUIFont"/>
+          <w:kern w:val="0"/>
+          <w:sz w:val="26"/>
+          <w:szCs w:val="26"/>
+        </w:rPr>
+        <w:t>(MCMMPE pentru ARMAX și BJ):</w:t>
+      </w:r>
+    </w:p>
+    <w:p>
+      <w:pPr>
+        <w:autoSpaceDE w:val="0"/>
+        <w:autoSpaceDN w:val="0"/>
+        <w:adjustRightInd w:val="0"/>
+        <w:spacing w:after="0" w:line="240" w:lineRule="auto"/>
+        <w:rPr>
+          <w:rFonts w:ascii="AppleSystemUIFont" w:hAnsi="AppleSystemUIFont" w:cs="AppleSystemUIFont"/>
+          <w:kern w:val="0"/>
+          <w:sz w:val="26"/>
+          <w:szCs w:val="26"/>
+        </w:rPr>
+      </w:pPr>
+      <w:r>
+        <w:rPr>
+          <w:rFonts w:ascii="AppleSystemUIFont" w:hAnsi="AppleSystemUIFont" w:cs="AppleSystemUIFont"/>
+          <w:kern w:val="0"/>
+          <w:sz w:val="26"/>
+          <w:szCs w:val="26"/>
+        </w:rPr>
+        <w:t xml:space="preserve">       * Implementarea funcțiilor armax_e și bj_e care folosesc metoda celor mai mici pătrate extinsă (MCMMPE). Această metodă presupune:</w:t>
+      </w:r>
+    </w:p>
+    <w:p>
+      <w:pPr>
+        <w:autoSpaceDE w:val="0"/>
+        <w:autoSpaceDN w:val="0"/>
+        <w:adjustRightInd w:val="0"/>
+        <w:spacing w:after="0" w:line="240" w:lineRule="auto"/>
+        <w:rPr>
+          <w:rFonts w:ascii="AppleSystemUIFont" w:hAnsi="AppleSystemUIFont" w:cs="AppleSystemUIFont"/>
+          <w:kern w:val="0"/>
+          <w:sz w:val="26"/>
+          <w:szCs w:val="26"/>
+        </w:rPr>
+      </w:pPr>
+      <w:r>
+        <w:rPr>
+          <w:rFonts w:ascii="AppleSystemUIFont" w:hAnsi="AppleSystemUIFont" w:cs="AppleSystemUIFont"/>
+          <w:kern w:val="0"/>
+          <w:sz w:val="26"/>
+          <w:szCs w:val="26"/>
+        </w:rPr>
+        <w:t xml:space="preserve">           * Estimarea zgomotului folosind un model ARX de ordin mare.</w:t>
+      </w:r>
+    </w:p>
+    <w:p>
+      <w:pPr>
+        <w:autoSpaceDE w:val="0"/>
+        <w:autoSpaceDN w:val="0"/>
+        <w:adjustRightInd w:val="0"/>
+        <w:spacing w:after="0" w:line="240" w:lineRule="auto"/>
+        <w:rPr>
+          <w:rFonts w:ascii="AppleSystemUIFont" w:hAnsi="AppleSystemUIFont" w:cs="AppleSystemUIFont"/>
+          <w:kern w:val="0"/>
+          <w:sz w:val="26"/>
+          <w:szCs w:val="26"/>
+        </w:rPr>
+      </w:pPr>
+      <w:r>
+        <w:rPr>
+          <w:rFonts w:ascii="AppleSystemUIFont" w:hAnsi="AppleSystemUIFont" w:cs="AppleSystemUIFont"/>
+          <w:kern w:val="0"/>
+          <w:sz w:val="26"/>
+          <w:szCs w:val="26"/>
+        </w:rPr>
+        <w:t xml:space="preserve">           * Folosirea zgomotului estimat ca regressor într-un model extins pentru </w:t>
+      </w:r>
+      <w:proofErr w:type="gramStart"/>
+      <w:r>
+        <w:rPr>
+          <w:rFonts w:ascii="AppleSystemUIFont" w:hAnsi="AppleSystemUIFont" w:cs="AppleSystemUIFont"/>
+          <w:kern w:val="0"/>
+          <w:sz w:val="26"/>
+          <w:szCs w:val="26"/>
+        </w:rPr>
+        <w:t>a</w:t>
+      </w:r>
+      <w:proofErr w:type="gramEnd"/>
+      <w:r>
+        <w:rPr>
+          <w:rFonts w:ascii="AppleSystemUIFont" w:hAnsi="AppleSystemUIFont" w:cs="AppleSystemUIFont"/>
+          <w:kern w:val="0"/>
+          <w:sz w:val="26"/>
+          <w:szCs w:val="26"/>
+        </w:rPr>
+        <w:t xml:space="preserve"> estima parametrii finali.</w:t>
+      </w:r>
+    </w:p>
+    <w:p>
+      <w:pPr>
+        <w:rPr>
+          <w:rFonts w:ascii="Arial" w:hAnsi="Arial" w:cs="Arial"/>
+          <w:b/>
+          <w:bCs/>
+          <w:sz w:val="36"/>
+          <w:szCs w:val="36"/>
+        </w:rPr>
+      </w:pPr>
+      <w:r>
+        <w:rPr>
+          <w:rFonts w:ascii="AppleSystemUIFont" w:hAnsi="AppleSystemUIFont" w:cs="AppleSystemUIFont"/>
+          <w:kern w:val="0"/>
+          <w:sz w:val="26"/>
+          <w:szCs w:val="26"/>
+        </w:rPr>
+        <w:t xml:space="preserve">       * Implementarea simulatorului ISLAB_6C.m pentru a compara performanțele MCMMPE cu MMEP.</w:t>
       </w:r>
     </w:p>
     <w:p>
@@ -615,6 +836,7 @@
         <w:rPr>
           <w:rFonts w:ascii="Arial" w:hAnsi="Arial" w:cs="Arial"/>
         </w:rPr>
+        <w:lastRenderedPageBreak/>
         <w:t>In cadrul functiei armax_e, am implementat (MCMMPE) printr-un algoritm structurat in</w:t>
       </w:r>
       <w:r>
@@ -818,7 +1040,6 @@
         <w:rPr>
           <w:rFonts w:ascii="Arial" w:hAnsi="Arial" w:cs="Arial"/>
         </w:rPr>
-        <w:lastRenderedPageBreak/>
         <w:t>In a doua etapa, am construit manual matricea regresorilor. Aceasta a fost formata prin</w:t>
       </w:r>
       <w:r>
@@ -945,6 +1166,7 @@
           <w:sz w:val="30"/>
           <w:szCs w:val="30"/>
         </w:rPr>
+        <w:lastRenderedPageBreak/>
         <w:drawing>
           <wp:inline distT="0" distB="0" distL="0" distR="0" wp14:anchorId="4F8E8962" wp14:editId="04BE0E3A">
             <wp:extent cx="5943600" cy="3790950"/>
@@ -1292,6 +1514,7 @@
         <w:rPr>
           <w:rFonts w:ascii="Arial" w:hAnsi="Arial" w:cs="Arial"/>
         </w:rPr>
+        <w:lastRenderedPageBreak/>
         <w:t>functiei de cost, rafinand parametrii pana la convergenta. In contrast, MCMMPE este o</w:t>
       </w:r>
       <w:r>

</xml_diff>

<commit_message>
FInished presentation for all labs with some small changes needed during the presentations
</commit_message>
<xml_diff>
--- a/LAB V/Tema5.docx
+++ b/LAB V/Tema5.docx
@@ -67,7 +67,7 @@
       </w:pPr>
       <w:r>
         <w:rPr>
-          <w:rFonts w:ascii="AppleSystemUIFont" w:hAnsi="AppleSystemUIFont" w:cs="AppleSystemUIFont"/>
+          <w:rFonts w:ascii="Arial" w:hAnsi="Arial" w:cs="Arial"/>
           <w:kern w:val="0"/>
           <w:sz w:val="26"/>
           <w:szCs w:val="26"/>
@@ -76,7 +76,7 @@
       </w:r>
       <w:r>
         <w:rPr>
-          <w:rFonts w:ascii="AppleSystemUIFont" w:hAnsi="AppleSystemUIFont" w:cs="AppleSystemUIFont"/>
+          <w:rFonts w:ascii="Arial" w:hAnsi="Arial" w:cs="Arial"/>
           <w:b/>
           <w:bCs/>
           <w:kern w:val="0"/>
@@ -87,68 +87,32 @@
       </w:r>
       <w:r>
         <w:rPr>
-          <w:rFonts w:ascii="AppleSystemUIFont" w:hAnsi="AppleSystemUIFont" w:cs="AppleSystemUIFont"/>
+          <w:rFonts w:ascii="Arial" w:hAnsi="Arial" w:cs="Arial"/>
           <w:kern w:val="0"/>
           <w:sz w:val="26"/>
           <w:szCs w:val="26"/>
         </w:rPr>
-        <w:t xml:space="preserve"> Aceasta folosește metoda minimiz</w:t>
-      </w:r>
-      <w:r>
-        <w:rPr>
-          <w:rFonts w:ascii="AppleSystemUIFont" w:hAnsi="AppleSystemUIFont" w:cs="AppleSystemUIFont"/>
+        <w:t xml:space="preserve"> Aceasta folosește metoda minimizarii erorii de predicție (MMEP) pentru </w:t>
+      </w:r>
+      <w:proofErr w:type="gramStart"/>
+      <w:r>
+        <w:rPr>
+          <w:rFonts w:ascii="Arial" w:hAnsi="Arial" w:cs="Arial"/>
           <w:kern w:val="0"/>
           <w:sz w:val="26"/>
           <w:szCs w:val="26"/>
         </w:rPr>
         <w:t>a</w:t>
       </w:r>
-      <w:r>
-        <w:rPr>
-          <w:rFonts w:ascii="AppleSystemUIFont" w:hAnsi="AppleSystemUIFont" w:cs="AppleSystemUIFont"/>
+      <w:proofErr w:type="gramEnd"/>
+      <w:r>
+        <w:rPr>
+          <w:rFonts w:ascii="Arial" w:hAnsi="Arial" w:cs="Arial"/>
           <w:kern w:val="0"/>
           <w:sz w:val="26"/>
           <w:szCs w:val="26"/>
         </w:rPr>
-        <w:t xml:space="preserve">rii erorii de predicție (MMEP) pentru </w:t>
-      </w:r>
-      <w:proofErr w:type="gramStart"/>
-      <w:r>
-        <w:rPr>
-          <w:rFonts w:ascii="AppleSystemUIFont" w:hAnsi="AppleSystemUIFont" w:cs="AppleSystemUIFont"/>
-          <w:kern w:val="0"/>
-          <w:sz w:val="26"/>
-          <w:szCs w:val="26"/>
-        </w:rPr>
-        <w:t>a</w:t>
-      </w:r>
-      <w:proofErr w:type="gramEnd"/>
-      <w:r>
-        <w:rPr>
-          <w:rFonts w:ascii="AppleSystemUIFont" w:hAnsi="AppleSystemUIFont" w:cs="AppleSystemUIFont"/>
-          <w:kern w:val="0"/>
-          <w:sz w:val="26"/>
-          <w:szCs w:val="26"/>
-        </w:rPr>
-        <w:t xml:space="preserve"> identifica un model ARMAX. Se bazeaz</w:t>
-      </w:r>
-      <w:r>
-        <w:rPr>
-          <w:rFonts w:ascii="AppleSystemUIFont" w:hAnsi="AppleSystemUIFont" w:cs="AppleSystemUIFont"/>
-          <w:kern w:val="0"/>
-          <w:sz w:val="26"/>
-          <w:szCs w:val="26"/>
-        </w:rPr>
-        <w:t>a</w:t>
-      </w:r>
-      <w:r>
-        <w:rPr>
-          <w:rFonts w:ascii="AppleSystemUIFont" w:hAnsi="AppleSystemUIFont" w:cs="AppleSystemUIFont"/>
-          <w:kern w:val="0"/>
-          <w:sz w:val="26"/>
-          <w:szCs w:val="26"/>
-        </w:rPr>
-        <w:t xml:space="preserve"> pe funcția armax din MATLAB System Identification Toolbox.</w:t>
+        <w:t xml:space="preserve"> identifica un model ARMAX. Se bazeaza pe funcția armax din MATLAB System Identification Toolbox.</w:t>
       </w:r>
     </w:p>
     <w:p>
@@ -354,7 +318,7 @@
     <w:p>
       <w:pPr>
         <w:rPr>
-          <w:rFonts w:ascii="AppleSystemUIFont" w:hAnsi="AppleSystemUIFont" w:cs="AppleSystemUIFont"/>
+          <w:rFonts w:ascii="Arial" w:hAnsi="Arial" w:cs="Arial"/>
           <w:kern w:val="0"/>
           <w:sz w:val="26"/>
           <w:szCs w:val="26"/>
@@ -362,27 +326,36 @@
       </w:pPr>
       <w:r>
         <w:rPr>
-          <w:rFonts w:ascii="AppleSystemUIFont" w:hAnsi="AppleSystemUIFont" w:cs="AppleSystemUIFont"/>
+          <w:rFonts w:ascii="Arial" w:hAnsi="Arial" w:cs="Arial"/>
           <w:kern w:val="0"/>
           <w:sz w:val="26"/>
           <w:szCs w:val="26"/>
         </w:rPr>
-        <w:t>BJ cu MMEP): Trebuie creat un simulator similar (</w:t>
-      </w:r>
-      <w:r>
-        <w:rPr>
-          <w:rFonts w:ascii="AppleSystemUIFont" w:hAnsi="AppleSystemUIFont" w:cs="AppleSystemUIFont"/>
-          <w:b/>
-          <w:bCs/>
+        <w:t>(</w:t>
+      </w:r>
+      <w:r>
+        <w:rPr>
+          <w:rFonts w:ascii="Arial" w:hAnsi="Arial" w:cs="Arial"/>
           <w:kern w:val="0"/>
           <w:sz w:val="26"/>
           <w:szCs w:val="26"/>
         </w:rPr>
+        <w:t>BJ cu MMEP): Trebuie creat un simulator similar (</w:t>
+      </w:r>
+      <w:r>
+        <w:rPr>
+          <w:rFonts w:ascii="Arial" w:hAnsi="Arial" w:cs="Arial"/>
+          <w:b/>
+          <w:bCs/>
+          <w:kern w:val="0"/>
+          <w:sz w:val="26"/>
+          <w:szCs w:val="26"/>
+        </w:rPr>
         <w:t>ISLAB_6B.m</w:t>
       </w:r>
       <w:r>
         <w:rPr>
-          <w:rFonts w:ascii="AppleSystemUIFont" w:hAnsi="AppleSystemUIFont" w:cs="AppleSystemUIFont"/>
+          <w:rFonts w:ascii="Arial" w:hAnsi="Arial" w:cs="Arial"/>
           <w:kern w:val="0"/>
           <w:sz w:val="26"/>
           <w:szCs w:val="26"/>
@@ -501,6 +474,20 @@
           <w:rFonts w:ascii="Arial" w:hAnsi="Arial" w:cs="Arial"/>
         </w:rPr>
       </w:pPr>
+      <w:r>
+        <w:rPr>
+          <w:rFonts w:ascii="Arial" w:hAnsi="Arial" w:cs="Arial"/>
+        </w:rPr>
+        <w:t xml:space="preserve">      </w:t>
+      </w:r>
+    </w:p>
+    <w:p>
+      <w:pPr>
+        <w:pStyle w:val="p1"/>
+        <w:rPr>
+          <w:rFonts w:ascii="Arial" w:hAnsi="Arial" w:cs="Arial"/>
+        </w:rPr>
+      </w:pPr>
     </w:p>
     <w:p>
       <w:pPr>
@@ -576,7 +563,7 @@
         <w:adjustRightInd w:val="0"/>
         <w:spacing w:after="0" w:line="240" w:lineRule="auto"/>
         <w:rPr>
-          <w:rFonts w:ascii="AppleSystemUIFont" w:hAnsi="AppleSystemUIFont" w:cs="AppleSystemUIFont"/>
+          <w:rFonts w:ascii="Arial" w:hAnsi="Arial" w:cs="Arial"/>
           <w:kern w:val="0"/>
           <w:sz w:val="26"/>
           <w:szCs w:val="26"/>
@@ -584,7 +571,7 @@
       </w:pPr>
       <w:r>
         <w:rPr>
-          <w:rFonts w:ascii="AppleSystemUIFont" w:hAnsi="AppleSystemUIFont" w:cs="AppleSystemUIFont"/>
+          <w:rFonts w:ascii="Arial" w:hAnsi="Arial" w:cs="Arial"/>
           <w:kern w:val="0"/>
           <w:sz w:val="26"/>
           <w:szCs w:val="26"/>
@@ -599,7 +586,7 @@
         <w:adjustRightInd w:val="0"/>
         <w:spacing w:after="0" w:line="240" w:lineRule="auto"/>
         <w:rPr>
-          <w:rFonts w:ascii="AppleSystemUIFont" w:hAnsi="AppleSystemUIFont" w:cs="AppleSystemUIFont"/>
+          <w:rFonts w:ascii="Arial" w:hAnsi="Arial" w:cs="Arial"/>
           <w:kern w:val="0"/>
           <w:sz w:val="26"/>
           <w:szCs w:val="26"/>
@@ -607,7 +594,7 @@
       </w:pPr>
       <w:r>
         <w:rPr>
-          <w:rFonts w:ascii="AppleSystemUIFont" w:hAnsi="AppleSystemUIFont" w:cs="AppleSystemUIFont"/>
+          <w:rFonts w:ascii="Arial" w:hAnsi="Arial" w:cs="Arial"/>
           <w:kern w:val="0"/>
           <w:sz w:val="26"/>
           <w:szCs w:val="26"/>
@@ -622,7 +609,7 @@
         <w:adjustRightInd w:val="0"/>
         <w:spacing w:after="0" w:line="240" w:lineRule="auto"/>
         <w:rPr>
-          <w:rFonts w:ascii="AppleSystemUIFont" w:hAnsi="AppleSystemUIFont" w:cs="AppleSystemUIFont"/>
+          <w:rFonts w:ascii="Arial" w:hAnsi="Arial" w:cs="Arial"/>
           <w:kern w:val="0"/>
           <w:sz w:val="26"/>
           <w:szCs w:val="26"/>
@@ -630,7 +617,7 @@
       </w:pPr>
       <w:r>
         <w:rPr>
-          <w:rFonts w:ascii="AppleSystemUIFont" w:hAnsi="AppleSystemUIFont" w:cs="AppleSystemUIFont"/>
+          <w:rFonts w:ascii="Arial" w:hAnsi="Arial" w:cs="Arial"/>
           <w:kern w:val="0"/>
           <w:sz w:val="26"/>
           <w:szCs w:val="26"/>
@@ -645,7 +632,7 @@
         <w:adjustRightInd w:val="0"/>
         <w:spacing w:after="0" w:line="240" w:lineRule="auto"/>
         <w:rPr>
-          <w:rFonts w:ascii="AppleSystemUIFont" w:hAnsi="AppleSystemUIFont" w:cs="AppleSystemUIFont"/>
+          <w:rFonts w:ascii="Arial" w:hAnsi="Arial" w:cs="Arial"/>
           <w:kern w:val="0"/>
           <w:sz w:val="26"/>
           <w:szCs w:val="26"/>
@@ -653,7 +640,7 @@
       </w:pPr>
       <w:r>
         <w:rPr>
-          <w:rFonts w:ascii="AppleSystemUIFont" w:hAnsi="AppleSystemUIFont" w:cs="AppleSystemUIFont"/>
+          <w:rFonts w:ascii="Arial" w:hAnsi="Arial" w:cs="Arial"/>
           <w:kern w:val="0"/>
           <w:sz w:val="26"/>
           <w:szCs w:val="26"/>
@@ -663,7 +650,7 @@
       <w:proofErr w:type="gramStart"/>
       <w:r>
         <w:rPr>
-          <w:rFonts w:ascii="AppleSystemUIFont" w:hAnsi="AppleSystemUIFont" w:cs="AppleSystemUIFont"/>
+          <w:rFonts w:ascii="Arial" w:hAnsi="Arial" w:cs="Arial"/>
           <w:kern w:val="0"/>
           <w:sz w:val="26"/>
           <w:szCs w:val="26"/>
@@ -673,7 +660,7 @@
       <w:proofErr w:type="gramEnd"/>
       <w:r>
         <w:rPr>
-          <w:rFonts w:ascii="AppleSystemUIFont" w:hAnsi="AppleSystemUIFont" w:cs="AppleSystemUIFont"/>
+          <w:rFonts w:ascii="Arial" w:hAnsi="Arial" w:cs="Arial"/>
           <w:kern w:val="0"/>
           <w:sz w:val="26"/>
           <w:szCs w:val="26"/>
@@ -693,7 +680,7 @@
       </w:pPr>
       <w:r>
         <w:rPr>
-          <w:rFonts w:ascii="AppleSystemUIFont" w:hAnsi="AppleSystemUIFont" w:cs="AppleSystemUIFont"/>
+          <w:rFonts w:ascii="Arial" w:hAnsi="Arial" w:cs="Arial"/>
           <w:kern w:val="0"/>
           <w:sz w:val="26"/>
           <w:szCs w:val="26"/>
@@ -836,7 +823,6 @@
         <w:rPr>
           <w:rFonts w:ascii="Arial" w:hAnsi="Arial" w:cs="Arial"/>
         </w:rPr>
-        <w:lastRenderedPageBreak/>
         <w:t>In cadrul functiei armax_e, am implementat (MCMMPE) printr-un algoritm structurat in</w:t>
       </w:r>
       <w:r>
@@ -995,28 +981,6 @@
         </w:rPr>
         <w:t>identificari ARX au fost considerate o estimare valida a zgomotului alb real</w:t>
       </w:r>
-    </w:p>
-    <w:p>
-      <w:pPr>
-        <w:rPr>
-          <w:rFonts w:ascii="Arial" w:hAnsi="Arial" w:cs="Arial"/>
-          <w:b/>
-          <w:bCs/>
-          <w:sz w:val="30"/>
-          <w:szCs w:val="30"/>
-        </w:rPr>
-      </w:pPr>
-    </w:p>
-    <w:p>
-      <w:pPr>
-        <w:rPr>
-          <w:rFonts w:ascii="Arial" w:hAnsi="Arial" w:cs="Arial"/>
-          <w:b/>
-          <w:bCs/>
-          <w:sz w:val="30"/>
-          <w:szCs w:val="30"/>
-        </w:rPr>
-      </w:pPr>
     </w:p>
     <w:p>
       <w:pPr>
@@ -1166,7 +1130,6 @@
           <w:sz w:val="30"/>
           <w:szCs w:val="30"/>
         </w:rPr>
-        <w:lastRenderedPageBreak/>
         <w:drawing>
           <wp:inline distT="0" distB="0" distL="0" distR="0" wp14:anchorId="4F8E8962" wp14:editId="04BE0E3A">
             <wp:extent cx="5943600" cy="3790950"/>
@@ -1272,6 +1235,7 @@
         <w:rPr>
           <w:rFonts w:ascii="Arial" w:hAnsi="Arial" w:cs="Arial"/>
         </w:rPr>
+        <w:lastRenderedPageBreak/>
         <w:t>Aplicarea MCMMPE pentru structura Box-Jenkins (BJ) a necesitat o abordare indirecta,</w:t>
       </w:r>
       <w:r>
@@ -1428,7 +1392,19 @@
         <w:rPr>
           <w:rFonts w:ascii="Arial" w:hAnsi="Arial" w:cs="Arial"/>
         </w:rPr>
-        <w:t>numaratorii B si C au fost obtinuti prin deconvolutie polinomiala.</w:t>
+        <w:t>numaratorii B si C au fost obtinuti prin de</w:t>
+      </w:r>
+      <w:r>
+        <w:rPr>
+          <w:rFonts w:ascii="Arial" w:hAnsi="Arial" w:cs="Arial"/>
+        </w:rPr>
+        <w:t xml:space="preserve"> </w:t>
+      </w:r>
+      <w:r>
+        <w:rPr>
+          <w:rFonts w:ascii="Arial" w:hAnsi="Arial" w:cs="Arial"/>
+        </w:rPr>
+        <w:t>convolutie polinomiala.</w:t>
       </w:r>
     </w:p>
     <w:p>
@@ -1514,7 +1490,6 @@
         <w:rPr>
           <w:rFonts w:ascii="Arial" w:hAnsi="Arial" w:cs="Arial"/>
         </w:rPr>
-        <w:lastRenderedPageBreak/>
         <w:t>functiei de cost, rafinand parametrii pana la convergenta. In contrast, MCMMPE este o</w:t>
       </w:r>
       <w:r>

</xml_diff>